<commit_message>
AUTH-012 — Implement Access Token B2B Endpoint Acceptance Criteria - Valid request return HTTP 200. - Response code 2007300. - Access token tidak kosong. - Token metadata tersimpan. - Signature audit log tersimpan. - API audit log tersimpan. - Invalid signature return 4017300. - Missing mandatory field return 4007302. - Unexpected error return 5007300.
</commit_message>
<xml_diff>
--- a/docs/PRD_Auth_Service_SNAP_Keamanan.docx
+++ b/docs/PRD_Auth_Service_SNAP_Keamanan.docx
@@ -3366,16 +3366,8 @@
             <w:vAlign w:val="top"/>
           </w:tcPr>
           <w:p>
-            <w:pPr>
-              <w:spacing w:after="0" w:line="240" w:lineRule="auto"/>
-            </w:pPr>
-            <w:r>
-              <w:rPr>
-                <w:rFonts w:ascii="Arial" w:hAnsi="Arial"/>
-                <w:b w:val="0"/>
-                <w:sz w:val="16"/>
-              </w:rPr>
-              <w:t>/api/v1/access-token/b2b</w:t>
+            <w:r>
+              <w:t>/cashup/v1.0/access-token/b2b</w:t>
             </w:r>
           </w:p>
         </w:tc>
@@ -3837,7 +3829,7 @@
     </w:p>
     <w:p>
       <w:r>
-        <w:t>Request header wajib: Content-Type=application/json, X-TIMESTAMP, X-CLIENT-KEY, X-SIGNATURE.</w:t>
+        <w:t>Endpoint implementasi: POST /cashup/v1.0/access-token/b2b. Standar ASPI path: ../{version}/access-token/b2b. Request header wajib: Content-Type=application/json, X-TIMESTAMP, X-CLIENT-KEY, X-SIGNATURE.</w:t>
       </w:r>
     </w:p>
     <w:p>
@@ -3898,7 +3890,7 @@
     </w:p>
     <w:p>
       <w:r>
-        <w:t>Success response contoh:</w:t>
+        <w:t>Success response header wajib: X-TIMESTAMP dan X-CLIENT-KEY. Success response body contoh:</w:t>
       </w:r>
     </w:p>
     <w:p>
@@ -3995,6 +3987,26 @@
       </w:r>
     </w:p>
     <w:p>
+      <w:r>
+        <w:t>Catatan sinkronisasi ASPI Access Token B2B: service code 73, version 1.0, HTTP method POST, standard path ../{version}/access-token/b2b; pada service ini concrete endpoint adalah /cashup/v1.0/access-token/b2b.</w:t>
+      </w:r>
+    </w:p>
+    <w:p>
+      <w:r>
+        <w:t>String-to-sign Access Token B2B: client_id + "|" + X-TIMESTAMP. X-SIGNATURE menggunakan asymmetric signature SHA256withRSA dengan private key partner dan diverifikasi menggunakan public key partner yang tersimpan.</w:t>
+      </w:r>
+    </w:p>
+    <w:p>
+      <w:r>
+        <w:t>Access Token B2B response mengikuti sample ASPI: header X-TIMESTAMP dan X-CLIENT-KEY dikembalikan; body berisi responseCode, responseMessage, accessToken, tokenType=Bearer, expiresIn dalam detik sebagai string, dan optional additionalInfo.</w:t>
+      </w:r>
+    </w:p>
+    <w:p>
+      <w:r>
+        <w:t>Catatan transaksi B2B untuk downstream API: header transaksi memakai Content-Type, Authorization Bearer, X-TIMESTAMP, X-SIGNATURE, ORIGIN optional, X-PARTNER-ID, X-EXTERNAL-ID, dan CHANNEL-ID. Symmetric signature default menggunakan HMAC_SHA512 dengan stringToSign = HTTPMethod + ":" + EndpointUrl + ":" + AccessToken + ":" + Lowercase(HexEncode(SHA-256(minify(RequestBody)))) + ":" + TimeStamp.</w:t>
+      </w:r>
+    </w:p>
+    <w:p>
       <w:pPr>
         <w:pStyle w:val="2"/>
       </w:pPr>
@@ -4703,16 +4715,8 @@
             <w:vAlign w:val="top"/>
           </w:tcPr>
           <w:p>
-            <w:pPr>
-              <w:spacing w:after="0" w:line="240" w:lineRule="auto"/>
-            </w:pPr>
-            <w:r>
-              <w:rPr>
-                <w:rFonts w:ascii="Arial" w:hAnsi="Arial"/>
-                <w:b w:val="0"/>
-                <w:sz w:val="16"/>
-              </w:rPr>
-              <w:t>Return SNAP response code 2007300 dan tokenType Bearer.</w:t>
+            <w:r>
+              <w:t>Return SNAP response code 2007300, tokenType Bearer, expiresIn string, dan response header X-TIMESTAMP serta X-CLIENT-KEY.</w:t>
             </w:r>
           </w:p>
         </w:tc>

</xml_diff>